<commit_message>
Add NM project documentation (22 docs, 8 phases)
</commit_message>
<xml_diff>
--- a/1 Brainstorming & Ideation/Brainstorming & Idea Prioritization.docx
+++ b/1 Brainstorming & Ideation/Brainstorming & Idea Prioritization.docx
@@ -81,7 +81,7 @@
             <w:bookmarkEnd w:id="1"/>
             <w:r>
               <w:rPr/>
-              <w:t xml:space="preserve">02 October 2026</w:t>
+              <w:t>01/10/2026</w:t>
             </w:r>
           </w:p>
         </w:tc>
@@ -215,6 +215,56 @@
                 <w:sz w:val="24"/>
               </w:rPr>
               <w:t xml:space="preserve">PocketSmart AI</w:t>
+            </w:r>
+          </w:p>
+        </w:tc>
+      </w:tr>
+      <w:tr>
+        <w:trPr>
+          <w:trHeight w:val="460" w:hRule="atLeast"/>
+        </w:trPr>
+        <w:tc>
+          <w:tcPr>
+            <w:tcW w:w="3220" w:type="dxa"/>
+          </w:tcPr>
+          <w:p>
+            <w:pPr>
+              <w:pStyle w:val="TableParagraph"/>
+              <w:spacing w:before="76"/>
+              <w:ind w:left="109"/>
+              <w:rPr>
+                <w:b/>
+                <w:sz w:val="24"/>
+              </w:rPr>
+            </w:pPr>
+            <w:r>
+              <w:rPr>
+                <w:b/>
+                <w:sz w:val="24"/>
+              </w:rPr>
+              <w:t>Guide</w:t>
+            </w:r>
+          </w:p>
+        </w:tc>
+        <w:tc>
+          <w:tcPr>
+            <w:tcW w:w="6120" w:type="dxa"/>
+          </w:tcPr>
+          <w:p>
+            <w:pPr>
+              <w:pStyle w:val="TableParagraph"/>
+              <w:spacing w:before="76"/>
+              <w:ind w:left="114"/>
+              <w:rPr>
+                <w:sz w:val="24"/>
+              </w:rPr>
+            </w:pPr>
+            <w:r>
+              <w:rPr>
+                <w:spacing w:val="-2"/>
+                <w:sz w:val="24"/>
+              </w:rPr>
+              <w:t>N. Indumathi AP/CSE</w:t>
             </w:r>
           </w:p>
         </w:tc>
@@ -336,13 +386,7 @@
       </w:pPr>
       <w:r>
         <w:rPr/>
-        <w:t>Each team member lists out as many ideas as possible without judging them at this </w:t>
-      </w:r>
-      <w:r>
-        <w:rPr>
-          <w:spacing w:val="-2"/>
-        </w:rPr>
-        <w:t>stage.</w:t>
+        <w:t>Each team member listed ideas freely, without judging them at this stage.</w:t>
       </w:r>
     </w:p>
     <w:p>
@@ -899,7 +943,7 @@
               <w:rPr>
                 <w:sz w:val="24"/>
               </w:rPr>
-              <w:t xml:space="preserve">PocketSmart AI: budget and recommendation assistant that categorizes spending, flags anomalies and forecasts</w:t>
+              <w:t>PocketSmart AI: budget and recommendation assistant that turns a budget into verified product plans for home, party and jewelry</w:t>
             </w:r>
           </w:p>
         </w:tc>
@@ -918,7 +962,7 @@
               <w:rPr>
                 <w:sz w:val="24"/>
               </w:rPr>
-              <w:t xml:space="preserve">Finance</w:t>
+              <w:t>Shopping / Budget planning</w:t>
             </w:r>
           </w:p>
         </w:tc>
@@ -1086,7 +1130,7 @@
               <w:rPr>
                 <w:sz w:val="24"/>
               </w:rPr>
-              <w:t xml:space="preserve">Mukilkani R P</w:t>
+              <w:t>Mukilkani R P</w:t>
             </w:r>
           </w:p>
         </w:tc>
@@ -1105,7 +1149,7 @@
               <w:rPr>
                 <w:sz w:val="24"/>
               </w:rPr>
-              <w:t xml:space="preserve">Festival-season spend forecasting and plain-English advice (feature of PocketSmart AI)</w:t>
+              <w:t>Jewelry matching from an outfit photo using Gemini multimodal input, within a budget</w:t>
             </w:r>
           </w:p>
         </w:tc>
@@ -1124,7 +1168,7 @@
               <w:rPr>
                 <w:sz w:val="24"/>
               </w:rPr>
-              <w:t xml:space="preserve">Finance</w:t>
+              <w:t>Shopping / Budget planning</w:t>
             </w:r>
           </w:p>
         </w:tc>
@@ -1180,147 +1224,7 @@
       </w:pPr>
       <w:r>
         <w:rPr/>
-        <w:t>Rate</w:t>
-      </w:r>
-      <w:r>
-        <w:rPr>
-          <w:spacing w:val="-3"/>
-        </w:rPr>
-        <w:t> </w:t>
-      </w:r>
-      <w:r>
-        <w:rPr/>
-        <w:t>each</w:t>
-      </w:r>
-      <w:r>
-        <w:rPr>
-          <w:spacing w:val="-3"/>
-        </w:rPr>
-        <w:t> </w:t>
-      </w:r>
-      <w:r>
-        <w:rPr/>
-        <w:t>grouped</w:t>
-      </w:r>
-      <w:r>
-        <w:rPr>
-          <w:spacing w:val="-3"/>
-        </w:rPr>
-        <w:t> </w:t>
-      </w:r>
-      <w:r>
-        <w:rPr/>
-        <w:t>idea</w:t>
-      </w:r>
-      <w:r>
-        <w:rPr>
-          <w:spacing w:val="-3"/>
-        </w:rPr>
-        <w:t> </w:t>
-      </w:r>
-      <w:r>
-        <w:rPr/>
-        <w:t>on</w:t>
-      </w:r>
-      <w:r>
-        <w:rPr>
-          <w:spacing w:val="-3"/>
-        </w:rPr>
-        <w:t> </w:t>
-      </w:r>
-      <w:r>
-        <w:rPr/>
-        <w:t>feasibility</w:t>
-      </w:r>
-      <w:r>
-        <w:rPr>
-          <w:spacing w:val="-3"/>
-        </w:rPr>
-        <w:t> </w:t>
-      </w:r>
-      <w:r>
-        <w:rPr/>
-        <w:t>and</w:t>
-      </w:r>
-      <w:r>
-        <w:rPr>
-          <w:spacing w:val="-3"/>
-        </w:rPr>
-        <w:t> </w:t>
-      </w:r>
-      <w:r>
-        <w:rPr/>
-        <w:t>importance,</w:t>
-      </w:r>
-      <w:r>
-        <w:rPr>
-          <w:spacing w:val="-3"/>
-        </w:rPr>
-        <w:t> </w:t>
-      </w:r>
-      <w:r>
-        <w:rPr/>
-        <w:t>then</w:t>
-      </w:r>
-      <w:r>
-        <w:rPr>
-          <w:spacing w:val="-3"/>
-        </w:rPr>
-        <w:t> </w:t>
-      </w:r>
-      <w:r>
-        <w:rPr/>
-        <w:t>select</w:t>
-      </w:r>
-      <w:r>
-        <w:rPr>
-          <w:spacing w:val="-3"/>
-        </w:rPr>
-        <w:t> </w:t>
-      </w:r>
-      <w:r>
-        <w:rPr/>
-        <w:t>the</w:t>
-      </w:r>
-      <w:r>
-        <w:rPr>
-          <w:spacing w:val="-3"/>
-        </w:rPr>
-        <w:t> </w:t>
-      </w:r>
-      <w:r>
-        <w:rPr/>
-        <w:t>final</w:t>
-      </w:r>
-      <w:r>
-        <w:rPr>
-          <w:spacing w:val="-3"/>
-        </w:rPr>
-        <w:t> </w:t>
-      </w:r>
-      <w:r>
-        <w:rPr/>
-        <w:t>idea(s)</w:t>
-      </w:r>
-      <w:r>
-        <w:rPr>
-          <w:spacing w:val="-3"/>
-        </w:rPr>
-        <w:t> </w:t>
-      </w:r>
-      <w:r>
-        <w:rPr/>
-        <w:t>to</w:t>
-      </w:r>
-      <w:r>
-        <w:rPr>
-          <w:spacing w:val="-3"/>
-        </w:rPr>
-        <w:t> </w:t>
-      </w:r>
-      <w:r>
-        <w:rPr/>
-        <w:t>move forward with.</w:t>
+        <w:t>Every grouped idea was rated on feasibility and importance, and the final idea was selected from the highest-rated group.</w:t>
       </w:r>
     </w:p>
     <w:p>
@@ -1704,7 +1608,7 @@
               <w:rPr>
                 <w:sz w:val="24"/>
               </w:rPr>
-              <w:t xml:space="preserve">PocketSmart AI: categorize, detect anomalies, forecast, advise</w:t>
+              <w:t>PocketSmart AI: Gemini-picked, budget-verified recommendations for Home Interior, Party and Jewelry</w:t>
             </w:r>
           </w:p>
         </w:tc>

</xml_diff>